<commit_message>
updated text extractor to use docx lib python instead of reading xml
</commit_message>
<xml_diff>
--- a/resume-scrubber/test_populator/populated_CV-047375 CV for Hindle, Laura.docx
+++ b/resume-scrubber/test_populator/populated_CV-047375 CV for Hindle, Laura.docx
@@ -458,7 +458,7 @@
                     <w:rStyle w:val="BodyTextChar"/>
                     <w:rFonts w:eastAsiaTheme="minorHAnsi"/>
                   </w:rPr>
-                  <w:t>Queen Elizabeth High School, Hexham | A level: 3A’s | Sept 01 - July 05</w:t>
+                  <w:t>Queen Elizabeth High School, Hexham | A level: 3A's | Sept 01 - July 05</w:t>
                 </w:r>
                 <w:r>
                   <w:rPr>
@@ -486,7 +486,7 @@
                     <w:rStyle w:val="BodyTextChar"/>
                     <w:rFonts w:eastAsiaTheme="minorHAnsi"/>
                   </w:rPr>
-                  <w:t>GCSEs: 6A*’s 3A’s</w:t>
+                  <w:t>GCSEs: 6A*'s 3A's</w:t>
                 </w:r>
               </w:p>
             </w:tc>
@@ -711,106 +711,6 @@
                   </w:rPr>
                   <w:t w:space="preserve">Represented regulatory at international conferences.</w:t>
                 </w:r>
-                <w:r>
-                  <w:rPr>
-                    <w:rStyle w:val="ITCVBody"/>
-                    <w:sz w:val="22"/>
-                  </w:rPr>
-                  <w:br/>
-                </w:r>
-                <w:r>
-                  <w:rPr>
-                    <w:rStyle w:val="ITCVBody"/>
-                    <w:sz w:val="22"/>
-                  </w:rPr>
-                  <w:tab/>
-                </w:r>
-                <w:r>
-                  <w:rPr>
-                    <w:rStyle w:val="ITCVBody"/>
-                  </w:rPr>
-                  <w:t w:space="preserve">Key Achievements:</w:t>
-                </w:r>
-                <w:r>
-                  <w:rPr>
-                    <w:rStyle w:val="ITCVBody"/>
-                    <w:sz w:val="22"/>
-                  </w:rPr>
-                  <w:br/>
-                </w:r>
-                <w:r>
-                  <w:rPr>
-                    <w:rStyle w:val="ITCVBody"/>
-                    <w:sz w:val="22"/>
-                  </w:rPr>
-                  <w:tab/>
-                </w:r>
-                <w:r>
-                  <w:rPr>
-                    <w:rStyle w:val="ITCVBody"/>
-                  </w:rPr>
-                  <w:t w:space="preserve">Coordinated and led EU health authority interactions and developed global HA interaction plans (FDA, EU, ORBIS markets), outlining key strategic objectives</w:t>
-                </w:r>
-                <w:r>
-                  <w:rPr>
-                    <w:rStyle w:val="ITCVBody"/>
-                    <w:sz w:val="22"/>
-                  </w:rPr>
-                  <w:br/>
-                </w:r>
-                <w:r>
-                  <w:rPr>
-                    <w:rStyle w:val="ITCVBody"/>
-                    <w:sz w:val="22"/>
-                  </w:rPr>
-                  <w:tab/>
-                </w:r>
-                <w:r>
-                  <w:rPr>
-                    <w:rStyle w:val="ITCVBody"/>
-                  </w:rPr>
-                  <w:t w:space="preserve">Leading global filing sequencing, utilising strong collaborations with Commercial, Market Access, Global development and CMC. Identifying optimum global submission sequence, presenting to senior leaders and negotiating resource to support submissions.</w:t>
-                </w:r>
-                <w:r>
-                  <w:rPr>
-                    <w:rStyle w:val="ITCVBody"/>
-                    <w:sz w:val="22"/>
-                  </w:rPr>
-                  <w:br/>
-                </w:r>
-                <w:r>
-                  <w:rPr>
-                    <w:rStyle w:val="ITCVBody"/>
-                    <w:sz w:val="22"/>
-                  </w:rPr>
-                  <w:tab/>
-                </w:r>
-                <w:r>
-                  <w:rPr>
-                    <w:rStyle w:val="ITCVBody"/>
-                  </w:rPr>
-                  <w:t w:space="preserve">Lead the strategy and agency interactions and obtained successful CHMP opinions for 4 x highly complex orphan designation applications in a parallel</w:t>
-                </w:r>
-                <w:r>
-                  <w:rPr>
-                    <w:rStyle w:val="ITCVBody"/>
-                    <w:sz w:val="22"/>
-                  </w:rPr>
-                  <w:br/>
-                </w:r>
-                <w:r>
-                  <w:rPr>
-                    <w:rStyle w:val="ITCVBody"/>
-                    <w:sz w:val="22"/>
-                  </w:rPr>
-                  <w:tab/>
-                </w:r>
-                <w:r>
-                  <w:rPr>
-                    <w:rStyle w:val="ITCVBody"/>
-                  </w:rPr>
-                  <w:t w:space="preserve">Regulatory lead for a number of due diligence activities, identifying and communicating RA risks and conducting gap analysis for potential clinical development plans</w:t>
-                </w:r>
               </w:p>
               <w:p>
                 <w:pPr>
@@ -846,7 +746,7 @@
                   <w:rPr>
                     <w:rStyle w:val="ITCVBody"/>
                   </w:rPr>
-                  <w:t w:space="preserve">Key Responsibilities:</w:t>
+                  <w:t w:space="preserve">Regional lead for EU and ROW COVID-19 developmental product.</w:t>
                 </w:r>
                 <w:r>
                   <w:rPr>
@@ -866,7 +766,7 @@
                   <w:rPr>
                     <w:rStyle w:val="ITCVBody"/>
                   </w:rPr>
-                  <w:t w:space="preserve">Regional lead for EU and ROW COVID-19 developmental product.</w:t>
+                  <w:t w:space="preserve">Led planning, preparation, and oversight of initial EU MAA activities.</w:t>
                 </w:r>
                 <w:r>
                   <w:rPr>
@@ -886,7 +786,7 @@
                   <w:rPr>
                     <w:rStyle w:val="ITCVBody"/>
                   </w:rPr>
-                  <w:t w:space="preserve">Led planning, preparation, and oversight of initial EU MAA activities.</w:t>
+                  <w:t w:space="preserve">Led EMA agency interactions (MAA pre-submission meetings, scientific advice, PIP pre-submission meetings) and supported FDA interactions (Type B &amp; C meetings).</w:t>
                 </w:r>
                 <w:r>
                   <w:rPr>
@@ -906,7 +806,7 @@
                   <w:rPr>
                     <w:rStyle w:val="ITCVBody"/>
                   </w:rPr>
-                  <w:t w:space="preserve">Led EMA agency interactions (MAA pre-submission meetings, scientific advice, PIP pre-submission meetings) and supported FDA interactions (Type B &amp; C meetings).</w:t>
+                  <w:t w:space="preserve">Managed a team working on COVID-19 pre- and post-approval activities, including initial CTAs, CTA amendments/maintenance, EMA scientific advice, EMA pre-MAA activities, Accelerated assessment applications, PIP activities, labelling variations, PSURs and RMP activities.</w:t>
                 </w:r>
                 <w:r>
                   <w:rPr>
@@ -926,7 +826,7 @@
                   <w:rPr>
                     <w:rStyle w:val="ITCVBody"/>
                   </w:rPr>
-                  <w:t w:space="preserve">Managed a team working on COVID-19 pre- and post-approval activities, including initial CTAs, CTA amendments/maintenance, EMA scientific advice, EMA pre-MAA activities, Accelerated assessment applications, PIP activities, labelling variations, PSURs and RMP activities.</w:t>
+                  <w:t w:space="preserve">Identified risks and provided mitigations for regulatory and product strategy to cross-functional teams.</w:t>
                 </w:r>
                 <w:r>
                   <w:rPr>
@@ -946,7 +846,7 @@
                   <w:rPr>
                     <w:rStyle w:val="ITCVBody"/>
                   </w:rPr>
-                  <w:t w:space="preserve">Identified risks and provided mitigations for regulatory and product strategy to cross-functional teams.</w:t>
+                  <w:t w:space="preserve">Led and developed the strategy of crucial scientific advice submissions.</w:t>
                 </w:r>
                 <w:r>
                   <w:rPr>
@@ -966,7 +866,7 @@
                   <w:rPr>
                     <w:rStyle w:val="ITCVBody"/>
                   </w:rPr>
-                  <w:t w:space="preserve">Led and developed the strategy of crucial scientific advice submissions.</w:t>
+                  <w:t w:space="preserve">Developed and executed complex regulatory strategies for several EU and ROW submissions (initial filings as well as post-authorisation submissions).</w:t>
                 </w:r>
                 <w:r>
                   <w:rPr>
@@ -986,7 +886,7 @@
                   <w:rPr>
                     <w:rStyle w:val="ITCVBody"/>
                   </w:rPr>
-                  <w:t w:space="preserve">Developed and executed complex regulatory strategies for several EU and ROW submissions (initial filings as well as post-authorisation submissions).</w:t>
+                  <w:t w:space="preserve">Collaborated with and influenced project teams to implement business objectives and deliverables.</w:t>
                 </w:r>
                 <w:r>
                   <w:rPr>
@@ -1006,7 +906,7 @@
                   <w:rPr>
                     <w:rStyle w:val="ITCVBody"/>
                   </w:rPr>
-                  <w:t w:space="preserve">Collaborated with and influenced project teams to implement business objectives and deliverables.</w:t>
+                  <w:t w:space="preserve">Developed global submission plans via interactions with affiliates and providing regulatory guidance and advice cross-functionally.</w:t>
                 </w:r>
                 <w:r>
                   <w:rPr>
@@ -1026,7 +926,7 @@
                   <w:rPr>
                     <w:rStyle w:val="ITCVBody"/>
                   </w:rPr>
-                  <w:t w:space="preserve">Developed global submission plans via interactions with affiliates and providing regulatory guidance and advice cross-functionally.</w:t>
+                  <w:t w:space="preserve">Line managed regulatory professionals, planned resources, and upskilled the wider team.</w:t>
                 </w:r>
                 <w:r>
                   <w:rPr>
@@ -1046,47 +946,7 @@
                   <w:rPr>
                     <w:rStyle w:val="ITCVBody"/>
                   </w:rPr>
-                  <w:t w:space="preserve">Line managed regulatory professionals, planned resources, and upskilled the wider team.</w:t>
-                </w:r>
-                <w:r>
-                  <w:rPr>
-                    <w:rStyle w:val="ITCVBody"/>
-                    <w:sz w:val="22"/>
-                  </w:rPr>
-                  <w:br/>
-                </w:r>
-                <w:r>
-                  <w:rPr>
-                    <w:rStyle w:val="ITCVBody"/>
-                    <w:sz w:val="22"/>
-                  </w:rPr>
-                  <w:tab/>
-                </w:r>
-                <w:r>
-                  <w:rPr>
-                    <w:rStyle w:val="ITCVBody"/>
-                  </w:rPr>
                   <w:t w:space="preserve">Led regulatory in audits/inspections and leading deviations and CAPAs.</w:t>
-                </w:r>
-                <w:r>
-                  <w:rPr>
-                    <w:rStyle w:val="ITCVBody"/>
-                    <w:sz w:val="22"/>
-                  </w:rPr>
-                  <w:br/>
-                </w:r>
-                <w:r>
-                  <w:rPr>
-                    <w:rStyle w:val="ITCVBody"/>
-                    <w:sz w:val="22"/>
-                  </w:rPr>
-                  <w:tab/>
-                </w:r>
-                <w:r>
-                  <w:rPr>
-                    <w:rStyle w:val="ITCVBody"/>
-                  </w:rPr>
-                  <w:t w:space="preserve">Key Achievements:</w:t>
                 </w:r>
                 <w:r>
                   <w:rPr>
@@ -1164,7 +1024,7 @@
                   <w:rPr>
                     <w:rStyle w:val="ITCVBody"/>
                   </w:rPr>
-                  <w:t w:space="preserve">Key Responsibilities:</w:t>
+                  <w:t w:space="preserve">Team lead for numerous high-profile HIV and COVID-19 development and post-approval assets.</w:t>
                 </w:r>
                 <w:r>
                   <w:rPr>
@@ -1184,7 +1044,7 @@
                   <w:rPr>
                     <w:rStyle w:val="ITCVBody"/>
                   </w:rPr>
-                  <w:t w:space="preserve">Team lead for numerous high-profile HIV and COVID-19 development and post-approval assets.</w:t>
+                  <w:t w:space="preserve">Led and contributed to multiple HIV and COVID-19 EU initial MAAs.</w:t>
                 </w:r>
                 <w:r>
                   <w:rPr>
@@ -1204,7 +1064,7 @@
                   <w:rPr>
                     <w:rStyle w:val="ITCVBody"/>
                   </w:rPr>
-                  <w:t w:space="preserve">Led and contributed to multiple HIV and COVID-19 EU initial MAAs.</w:t>
+                  <w:t w:space="preserve">EU and ACE regulatory lead for multiple newly authorised Virology products.</w:t>
                 </w:r>
                 <w:r>
                   <w:rPr>
@@ -1224,7 +1084,7 @@
                   <w:rPr>
                     <w:rStyle w:val="ITCVBody"/>
                   </w:rPr>
-                  <w:t w:space="preserve">EU and ACE regulatory lead for multiple newly authorised Virology products.</w:t>
+                  <w:t w:space="preserve">Extensive experience leading the strategy and coordinating numerous complex EU post authorisation activities, including variations, product information labelling updates, PSURs, PACs, RMP updates, implementation of artwork.</w:t>
                 </w:r>
                 <w:r>
                   <w:rPr>
@@ -1244,7 +1104,7 @@
                   <w:rPr>
                     <w:rStyle w:val="ITCVBody"/>
                   </w:rPr>
-                  <w:t w:space="preserve">Extensive experience leading the strategy and coordinating numerous complex EU post authorisation activities, including variations, product information labelling updates, PSURs, PACs, RMP updates, implementation of artwork.</w:t>
+                  <w:t w:space="preserve">Authored/coordinated content in advance of and leading/participating in pre-submission discussions.</w:t>
                 </w:r>
                 <w:r>
                   <w:rPr>
@@ -1264,7 +1124,7 @@
                   <w:rPr>
                     <w:rStyle w:val="ITCVBody"/>
                   </w:rPr>
-                  <w:t w:space="preserve">Authored/coordinated content in advance of and leading/participating in pre-submission discussions.</w:t>
+                  <w:t w:space="preserve">Led regulatory strategy discussions and influenced project team decisions, presented to senior leaders, worked closely with numerous functional areas and cross-functional teams.</w:t>
                 </w:r>
                 <w:r>
                   <w:rPr>
@@ -1284,7 +1144,7 @@
                   <w:rPr>
                     <w:rStyle w:val="ITCVBody"/>
                   </w:rPr>
-                  <w:t w:space="preserve">Led regulatory strategy discussions and influenced project team decisions, presented to senior leaders, worked closely with numerous functional areas and cross-functional teams.</w:t>
+                  <w:t w:space="preserve">Led and managed a team of FTEs and contractors, coached junior employees, planned resource and developed my team.</w:t>
                 </w:r>
                 <w:r>
                   <w:rPr>
@@ -1304,47 +1164,7 @@
                   <w:rPr>
                     <w:rStyle w:val="ITCVBody"/>
                   </w:rPr>
-                  <w:t w:space="preserve">Led and managed a team of FTEs and contractors, coached junior employees, planned resource and developed my team.</w:t>
-                </w:r>
-                <w:r>
-                  <w:rPr>
-                    <w:rStyle w:val="ITCVBody"/>
-                    <w:sz w:val="22"/>
-                  </w:rPr>
-                  <w:br/>
-                </w:r>
-                <w:r>
-                  <w:rPr>
-                    <w:rStyle w:val="ITCVBody"/>
-                    <w:sz w:val="22"/>
-                  </w:rPr>
-                  <w:tab/>
-                </w:r>
-                <w:r>
-                  <w:rPr>
-                    <w:rStyle w:val="ITCVBody"/>
-                  </w:rPr>
                   <w:t w:space="preserve">Member of and led several process improvements and company working groups.</w:t>
-                </w:r>
-                <w:r>
-                  <w:rPr>
-                    <w:rStyle w:val="ITCVBody"/>
-                    <w:sz w:val="22"/>
-                  </w:rPr>
-                  <w:br/>
-                </w:r>
-                <w:r>
-                  <w:rPr>
-                    <w:rStyle w:val="ITCVBody"/>
-                    <w:sz w:val="22"/>
-                  </w:rPr>
-                  <w:tab/>
-                </w:r>
-                <w:r>
-                  <w:rPr>
-                    <w:rStyle w:val="ITCVBody"/>
-                  </w:rPr>
-                  <w:t w:space="preserve">Key Achievements:</w:t>
                 </w:r>
                 <w:r>
                   <w:rPr>

</xml_diff>

<commit_message>
name, title, department implementation
</commit_message>
<xml_diff>
--- a/resume-scrubber/test_populator/populated_CV-047375 CV for Hindle, Laura.docx
+++ b/resume-scrubber/test_populator/populated_CV-047375 CV for Hindle, Laura.docx
@@ -87,7 +87,7 @@
                   <w:rPr>
                     <w:rStyle w:val="ITCVName"/>
                   </w:rPr>
-                  <w:t>INSERT_NAME</w:t>
+                  <w:t>Caroline Wei</w:t>
                 </w:r>
               </w:p>
             </w:tc>
@@ -161,7 +161,7 @@
                   <w:rPr>
                     <w:sz w:val="24"/>
                   </w:rPr>
-                  <w:t>INSERT_TITLE</w:t>
+                  <w:t>IT Intern</w:t>
                 </w:r>
               </w:p>
             </w:tc>
@@ -236,7 +236,7 @@
                   <w:rPr>
                     <w:rStyle w:val="ITCVBody"/>
                   </w:rPr>
-                  <w:t>INSERT_DEPARTMENT</w:t>
+                  <w:t>IT</w:t>
                 </w:r>
               </w:p>
             </w:tc>

</xml_diff>